<commit_message>
auto(daily): dev loop report 2026-06-01
</commit_message>
<xml_diff>
--- a/reports/hypothesis/2026-06-01.docx
+++ b/reports/hypothesis/2026-06-01.docx
@@ -15,7 +15,7 @@
         <w:rPr>
           <w:i/>
         </w:rPr>
-        <w:t>생성일: 2026-06-01 09:15 KST  |  표본: 측정소당 최소 2172건 / 총 11035건</w:t>
+        <w:t>생성일: 2026-06-01 14:14 KST  |  표본: 측정소당 최소 2178건 / 총 11065건</w:t>
       </w:r>
     </w:p>
     <w:p>
@@ -143,7 +143,7 @@
           </w:tcPr>
           <w:p>
             <w:r>
-              <w:t>38.272</w:t>
+              <w:t>38.254</w:t>
             </w:r>
           </w:p>
         </w:tc>
@@ -153,7 +153,7 @@
           </w:tcPr>
           <w:p>
             <w:r>
-              <w:t>34.156</w:t>
+              <w:t>34.151</w:t>
             </w:r>
           </w:p>
         </w:tc>
@@ -163,7 +163,7 @@
           </w:tcPr>
           <w:p>
             <w:r>
-              <w:t>+4.116</w:t>
+              <w:t>+4.103</w:t>
             </w:r>
           </w:p>
         </w:tc>
@@ -215,7 +215,7 @@
           </w:tcPr>
           <w:p>
             <w:r>
-              <w:t>21.283</w:t>
+              <w:t>21.273</w:t>
             </w:r>
           </w:p>
         </w:tc>
@@ -225,7 +225,7 @@
           </w:tcPr>
           <w:p>
             <w:r>
-              <w:t>17.735</w:t>
+              <w:t>17.739</w:t>
             </w:r>
           </w:p>
         </w:tc>
@@ -235,7 +235,7 @@
           </w:tcPr>
           <w:p>
             <w:r>
-              <w:t>+3.548</w:t>
+              <w:t>+3.535</w:t>
             </w:r>
           </w:p>
         </w:tc>
@@ -722,7 +722,7 @@
           </w:tcPr>
           <w:p>
             <w:r>
-              <w:t>75.61</w:t>
+              <w:t>75.76</w:t>
             </w:r>
           </w:p>
         </w:tc>
@@ -784,7 +784,7 @@
           </w:tcPr>
           <w:p>
             <w:r>
-              <w:t>17.19</w:t>
+              <w:t>16.92</w:t>
             </w:r>
           </w:p>
         </w:tc>
@@ -846,7 +846,7 @@
           </w:tcPr>
           <w:p>
             <w:r>
-              <w:t>141.22</w:t>
+              <w:t>140.51</w:t>
             </w:r>
           </w:p>
         </w:tc>
@@ -908,7 +908,7 @@
           </w:tcPr>
           <w:p>
             <w:r>
-              <w:t>73.29</w:t>
+              <w:t>71.15</w:t>
             </w:r>
           </w:p>
         </w:tc>
@@ -938,7 +938,7 @@
           </w:tcPr>
           <w:p>
             <w:r>
-              <w:t>0.027</w:t>
+              <w:t>0.026</w:t>
             </w:r>
           </w:p>
         </w:tc>
@@ -970,7 +970,7 @@
           </w:tcPr>
           <w:p>
             <w:r>
-              <w:t>154.12</w:t>
+              <w:t>154.76</w:t>
             </w:r>
           </w:p>
         </w:tc>
@@ -1029,7 +1029,7 @@
         <w:pStyle w:val="ListBullet"/>
       </w:pPr>
       <w:r>
-        <w:t>'산단 영향군'가 '베이스라인'보다 평균 3.55 높음 (p=0.0000, 효과크기 작음 d=0.26).</w:t>
+        <w:t>'산단 영향군'가 '베이스라인'보다 평균 3.53 높음 (p=0.0000, 효과크기 작음 d=0.26).</w:t>
       </w:r>
     </w:p>
     <w:p>

</xml_diff>